<commit_message>
feat: add notebook, test suite, power bi template and screenshots
</commit_message>
<xml_diff>
--- a/reports/ASG_Airlines_Pipeline_Documentation.docx
+++ b/reports/ASG_Airlines_Pipeline_Documentation.docx
@@ -3856,7 +3856,7 @@
         <w:rPr>
           <w:color w:val="0F172A"/>
         </w:rPr>
-        <w:t>9. Power BI Dashboard Specification &amp; Navigation Walkthrough</w:t>
+        <w:t>9. Power BI Dashboard Specification &amp; Visual Walkthrough</w:t>
       </w:r>
     </w:p>
     <w:p>
@@ -3864,15 +3864,56 @@
         <w:rPr>
           <w:sz w:val="20"/>
         </w:rPr>
-        <w:t>The Power BI dashboard was architected as a modular 4-page analytical application. Each page contains top-level KPI cards, interactive slicers (Airline, Route, Date Range), and cross-filtering analytical visuals:</w:t>
+        <w:t>The Power BI report was architected as a production-grade 4-page analytical suite. Each page contains executive KPI cards, interactive slicers (Airline, Route, Date Range), and cross-filtering analytical visuals. The dataset is exported in dual Parquet and CSV formats (`data/powerbi/`) accompanied by a standardized Power BI template (`dashboard/ASG_Airlines_Report.pbit`) and pre-calculated DAX measures (`data/powerbi/powerbi_dax_measures.dax`).</w:t>
+      </w:r>
+    </w:p>
+    <w:p>
+      <w:r>
+        <w:drawing>
+          <wp:inline xmlns:a="http://schemas.openxmlformats.org/drawingml/2006/main" xmlns:pic="http://schemas.openxmlformats.org/drawingml/2006/picture">
+            <wp:extent cx="5852160" cy="3885047"/>
+            <wp:docPr id="4" name="Picture 4"/>
+            <wp:cNvGraphicFramePr>
+              <a:graphicFrameLocks noChangeAspect="1"/>
+            </wp:cNvGraphicFramePr>
+            <a:graphic>
+              <a:graphicData uri="http://schemas.openxmlformats.org/drawingml/2006/picture">
+                <pic:pic>
+                  <pic:nvPicPr>
+                    <pic:cNvPr id="0" name="page1_duration_analysis.png"/>
+                    <pic:cNvPicPr/>
+                  </pic:nvPicPr>
+                  <pic:blipFill>
+                    <a:blip r:embed="rId12"/>
+                    <a:stretch>
+                      <a:fillRect/>
+                    </a:stretch>
+                  </pic:blipFill>
+                  <pic:spPr>
+                    <a:xfrm>
+                      <a:off x="0" y="0"/>
+                      <a:ext cx="5852160" cy="3885047"/>
+                    </a:xfrm>
+                    <a:prstGeom prst="rect"/>
+                  </pic:spPr>
+                </pic:pic>
+              </a:graphicData>
+            </a:graphic>
+          </wp:inline>
+        </w:drawing>
       </w:r>
     </w:p>
     <w:p>
       <w:pPr>
-        <w:pStyle w:val="Heading2"/>
+        <w:jc w:val="center"/>
       </w:pPr>
       <w:r>
-        <w:t>Page 1: Duration Analysis</w:t>
+        <w:rPr>
+          <w:i/>
+          <w:color w:val="64748B"/>
+          <w:sz w:val="17"/>
+        </w:rPr>
+        <w:t>Figure 4: Power BI Page 1 — Flight Duration &amp; Sector Analysis</w:t>
       </w:r>
     </w:p>
     <w:p>
@@ -3883,7 +3924,7 @@
         <w:rPr>
           <w:sz w:val="19"/>
         </w:rPr>
-        <w:t>KPI Cards: Overall Avg Duration (164.6 min), Min Duration (30 min), Max Duration (300 min), Overnight Flight Count (1).</w:t>
+        <w:t>KPI Cards: Overall Avg Duration (164.6 min), Min Duration (30.0 min), Max Duration (300.0 min), Overnight Repaired (1).</w:t>
       </w:r>
     </w:p>
     <w:p>
@@ -3905,15 +3946,61 @@
         <w:rPr>
           <w:sz w:val="19"/>
         </w:rPr>
-        <w:t>Visuals: Horizontal bar chart comparing average flight duration by route; Line chart tracking daily duration trends; Bar chart comparing duration by airline carrier.</w:t>
+        <w:t>Visuals: Top 8 Routes by Average Duration horizontal bar chart; Average Flight Duration by Airline carrier bar chart.</w:t>
       </w:r>
     </w:p>
     <w:p>
       <w:pPr>
-        <w:pStyle w:val="Heading2"/>
+        <w:spacing w:after="120"/>
+      </w:pPr>
+    </w:p>
+    <w:p>
+      <w:r>
+        <w:drawing>
+          <wp:inline xmlns:a="http://schemas.openxmlformats.org/drawingml/2006/main" xmlns:pic="http://schemas.openxmlformats.org/drawingml/2006/picture">
+            <wp:extent cx="5852160" cy="3885047"/>
+            <wp:docPr id="5" name="Picture 5"/>
+            <wp:cNvGraphicFramePr>
+              <a:graphicFrameLocks noChangeAspect="1"/>
+            </wp:cNvGraphicFramePr>
+            <a:graphic>
+              <a:graphicData uri="http://schemas.openxmlformats.org/drawingml/2006/picture">
+                <pic:pic>
+                  <pic:nvPicPr>
+                    <pic:cNvPr id="0" name="page2_route_performance.png"/>
+                    <pic:cNvPicPr/>
+                  </pic:nvPicPr>
+                  <pic:blipFill>
+                    <a:blip r:embed="rId13"/>
+                    <a:stretch>
+                      <a:fillRect/>
+                    </a:stretch>
+                  </pic:blipFill>
+                  <pic:spPr>
+                    <a:xfrm>
+                      <a:off x="0" y="0"/>
+                      <a:ext cx="5852160" cy="3885047"/>
+                    </a:xfrm>
+                    <a:prstGeom prst="rect"/>
+                  </pic:spPr>
+                </pic:pic>
+              </a:graphicData>
+            </a:graphic>
+          </wp:inline>
+        </w:drawing>
+      </w:r>
+    </w:p>
+    <w:p>
+      <w:pPr>
+        <w:jc w:val="center"/>
       </w:pPr>
       <w:r>
-        <w:t>Page 2: Route Performance</w:t>
+        <w:rPr>
+          <w:i/>
+          <w:color w:val="64748B"/>
+          <w:sz w:val="17"/>
+        </w:rPr>
+        <w:t>Figure 5: Power BI Page 2 — Route Traffic &amp; Operational Revenue</w:t>
       </w:r>
     </w:p>
     <w:p>
@@ -3924,7 +4011,7 @@
         <w:rPr>
           <w:sz w:val="19"/>
         </w:rPr>
-        <w:t>KPI Cards: Total Active Routes (30), Total Bookings (1,000), Cancellation Rate (31.4%), Total Operational Revenue (INR 8.05M).</w:t>
+        <w:t>KPI Cards: Active Domestic Routes (30), Total Bookings (1,000), Cancellation Rate (31.40%), Total Operational Revenue (INR 8.05M).</w:t>
       </w:r>
     </w:p>
     <w:p>
@@ -3946,15 +4033,61 @@
         <w:rPr>
           <w:sz w:val="19"/>
         </w:rPr>
-        <w:t>Visuals: Route Traffic Volume bar chart (Top 10 corridors); Route Revenue ranking; Stacked bar chart showing booking status breakdown (Confirmed, Cancelled, Pending) by route.</w:t>
+        <w:t>Visuals: Top 8 Busiest Routes flight instance volume; Top 8 Revenue Corridors in INR.</w:t>
       </w:r>
     </w:p>
     <w:p>
       <w:pPr>
-        <w:pStyle w:val="Heading2"/>
+        <w:spacing w:after="120"/>
+      </w:pPr>
+    </w:p>
+    <w:p>
+      <w:r>
+        <w:drawing>
+          <wp:inline xmlns:a="http://schemas.openxmlformats.org/drawingml/2006/main" xmlns:pic="http://schemas.openxmlformats.org/drawingml/2006/picture">
+            <wp:extent cx="5852160" cy="3885047"/>
+            <wp:docPr id="6" name="Picture 6"/>
+            <wp:cNvGraphicFramePr>
+              <a:graphicFrameLocks noChangeAspect="1"/>
+            </wp:cNvGraphicFramePr>
+            <a:graphic>
+              <a:graphicData uri="http://schemas.openxmlformats.org/drawingml/2006/picture">
+                <pic:pic>
+                  <pic:nvPicPr>
+                    <pic:cNvPr id="0" name="page3_airline_trends.png"/>
+                    <pic:cNvPicPr/>
+                  </pic:nvPicPr>
+                  <pic:blipFill>
+                    <a:blip r:embed="rId14"/>
+                    <a:stretch>
+                      <a:fillRect/>
+                    </a:stretch>
+                  </pic:blipFill>
+                  <pic:spPr>
+                    <a:xfrm>
+                      <a:off x="0" y="0"/>
+                      <a:ext cx="5852160" cy="3885047"/>
+                    </a:xfrm>
+                    <a:prstGeom prst="rect"/>
+                  </pic:spPr>
+                </pic:pic>
+              </a:graphicData>
+            </a:graphic>
+          </wp:inline>
+        </w:drawing>
+      </w:r>
+    </w:p>
+    <w:p>
+      <w:pPr>
+        <w:jc w:val="center"/>
       </w:pPr>
       <w:r>
-        <w:t>Page 3: Airline Trends</w:t>
+        <w:rPr>
+          <w:i/>
+          <w:color w:val="64748B"/>
+          <w:sz w:val="17"/>
+        </w:rPr>
+        <w:t>Figure 6: Power BI Page 3 — Airline Market Share &amp; Payment Trends</w:t>
       </w:r>
     </w:p>
     <w:p>
@@ -3965,7 +4098,7 @@
         <w:rPr>
           <w:sz w:val="19"/>
         </w:rPr>
-        <w:t>KPI Cards: Total Flights (1,005), Leading Airline Market Share (26.8% IndiGo), Average Ticket Fare (INR 8,054), Revenue Captured.</w:t>
+        <w:t>KPI Cards: Total Flights Operated (1,005), Leading Airline Market Share (26.77% IndiGo), Repaired Carriers (72), Top Payment Channel (UPI 35.8%).</w:t>
       </w:r>
     </w:p>
     <w:p>
@@ -3987,15 +4120,61 @@
         <w:rPr>
           <w:sz w:val="19"/>
         </w:rPr>
-        <w:t>Visuals: Donut chart showing flight distribution by airline; Clustered bar chart of airline operational revenue; Payment method distribution (UPI 35.8%, Card 32.9%, NetBanking 31.3%).</w:t>
+        <w:t>Visuals: Flight Share distribution donut chart by carrier; Payment Channel distribution by transaction volume (UPI, Card, NetBanking).</w:t>
       </w:r>
     </w:p>
     <w:p>
       <w:pPr>
-        <w:pStyle w:val="Heading2"/>
+        <w:spacing w:after="120"/>
+      </w:pPr>
+    </w:p>
+    <w:p>
+      <w:r>
+        <w:drawing>
+          <wp:inline xmlns:a="http://schemas.openxmlformats.org/drawingml/2006/main" xmlns:pic="http://schemas.openxmlformats.org/drawingml/2006/picture">
+            <wp:extent cx="5852160" cy="3885047"/>
+            <wp:docPr id="7" name="Picture 7"/>
+            <wp:cNvGraphicFramePr>
+              <a:graphicFrameLocks noChangeAspect="1"/>
+            </wp:cNvGraphicFramePr>
+            <a:graphic>
+              <a:graphicData uri="http://schemas.openxmlformats.org/drawingml/2006/picture">
+                <pic:pic>
+                  <pic:nvPicPr>
+                    <pic:cNvPr id="0" name="page4_delay_anomaly_insights.png"/>
+                    <pic:cNvPicPr/>
+                  </pic:nvPicPr>
+                  <pic:blipFill>
+                    <a:blip r:embed="rId15"/>
+                    <a:stretch>
+                      <a:fillRect/>
+                    </a:stretch>
+                  </pic:blipFill>
+                  <pic:spPr>
+                    <a:xfrm>
+                      <a:off x="0" y="0"/>
+                      <a:ext cx="5852160" cy="3885047"/>
+                    </a:xfrm>
+                    <a:prstGeom prst="rect"/>
+                  </pic:spPr>
+                </pic:pic>
+              </a:graphicData>
+            </a:graphic>
+          </wp:inline>
+        </w:drawing>
+      </w:r>
+    </w:p>
+    <w:p>
+      <w:pPr>
+        <w:jc w:val="center"/>
       </w:pPr>
       <w:r>
-        <w:t>Page 4: Delay &amp; Anomaly Insights</w:t>
+        <w:rPr>
+          <w:i/>
+          <w:color w:val="64748B"/>
+          <w:sz w:val="17"/>
+        </w:rPr>
+        <w:t>Figure 7: Power BI Page 4 — Delay, Anomaly &amp; Quality Audit</w:t>
       </w:r>
     </w:p>
     <w:p>
@@ -4006,7 +4185,7 @@
         <w:rPr>
           <w:sz w:val="19"/>
         </w:rPr>
-        <w:t>KPI Cards: Duration Outliers Detected (1), Repaired Overnight Flights (1), Repaired Airline Codes (72), Imputed Fares (78).</w:t>
+        <w:t>KPI Cards: Duration Outliers Detected (1), Negative Durations (0), Imputed Fare Values (78), Referential Integrity Loss (0.00%).</w:t>
       </w:r>
     </w:p>
     <w:p>
@@ -4028,8 +4207,13 @@
         <w:rPr>
           <w:sz w:val="19"/>
         </w:rPr>
-        <w:t>Visuals: Hourly Departure Flight Volume histogram (identifying peak departure traffic bands); Statistical Outlier Flight details table with route mean and standard deviation comparison; Audit breakdown of imputed vs confirmed transaction records.</w:t>
+        <w:t>Visuals: Diurnal Flight Traffic curve across 24-hour departure hours; Statistical Outlier Flight Audit table for Flight SJ192 with root cause analysis.</w:t>
       </w:r>
+    </w:p>
+    <w:p>
+      <w:pPr>
+        <w:spacing w:after="120"/>
+      </w:pPr>
     </w:p>
     <w:p>
       <w:pPr>

</xml_diff>

<commit_message>
feat: high-end professional diagrams, dashboard screenshots, and enhanced interactive dashboard
</commit_message>
<xml_diff>
--- a/reports/ASG_Airlines_Pipeline_Documentation.docx
+++ b/reports/ASG_Airlines_Pipeline_Documentation.docx
@@ -129,7 +129,7 @@
       <w:r>
         <w:drawing>
           <wp:inline xmlns:a="http://schemas.openxmlformats.org/drawingml/2006/main" xmlns:pic="http://schemas.openxmlformats.org/drawingml/2006/picture">
-            <wp:extent cx="5852160" cy="3147380"/>
+            <wp:extent cx="5852160" cy="2958235"/>
             <wp:docPr id="1" name="Picture 1"/>
             <wp:cNvGraphicFramePr>
               <a:graphicFrameLocks noChangeAspect="1"/>
@@ -150,7 +150,7 @@
                   <pic:spPr>
                     <a:xfrm>
                       <a:off x="0" y="0"/>
-                      <a:ext cx="5852160" cy="3147380"/>
+                      <a:ext cx="5852160" cy="2958235"/>
                     </a:xfrm>
                     <a:prstGeom prst="rect"/>
                   </pic:spPr>
@@ -700,7 +700,7 @@
       <w:r>
         <w:drawing>
           <wp:inline xmlns:a="http://schemas.openxmlformats.org/drawingml/2006/main" xmlns:pic="http://schemas.openxmlformats.org/drawingml/2006/picture">
-            <wp:extent cx="5852160" cy="2901491"/>
+            <wp:extent cx="5852160" cy="2375629"/>
             <wp:docPr id="2" name="Picture 2"/>
             <wp:cNvGraphicFramePr>
               <a:graphicFrameLocks noChangeAspect="1"/>
@@ -721,7 +721,7 @@
                   <pic:spPr>
                     <a:xfrm>
                       <a:off x="0" y="0"/>
-                      <a:ext cx="5852160" cy="2901491"/>
+                      <a:ext cx="5852160" cy="2375629"/>
                     </a:xfrm>
                     <a:prstGeom prst="rect"/>
                   </pic:spPr>
@@ -938,7 +938,7 @@
       <w:r>
         <w:drawing>
           <wp:inline xmlns:a="http://schemas.openxmlformats.org/drawingml/2006/main" xmlns:pic="http://schemas.openxmlformats.org/drawingml/2006/picture">
-            <wp:extent cx="5852160" cy="3357053"/>
+            <wp:extent cx="5852160" cy="3601329"/>
             <wp:docPr id="3" name="Picture 3"/>
             <wp:cNvGraphicFramePr>
               <a:graphicFrameLocks noChangeAspect="1"/>
@@ -959,7 +959,7 @@
                   <pic:spPr>
                     <a:xfrm>
                       <a:off x="0" y="0"/>
-                      <a:ext cx="5852160" cy="3357053"/>
+                      <a:ext cx="5852160" cy="3601329"/>
                     </a:xfrm>
                     <a:prstGeom prst="rect"/>
                   </pic:spPr>
@@ -3871,7 +3871,7 @@
       <w:r>
         <w:drawing>
           <wp:inline xmlns:a="http://schemas.openxmlformats.org/drawingml/2006/main" xmlns:pic="http://schemas.openxmlformats.org/drawingml/2006/picture">
-            <wp:extent cx="5852160" cy="3885047"/>
+            <wp:extent cx="5852160" cy="3737661"/>
             <wp:docPr id="4" name="Picture 4"/>
             <wp:cNvGraphicFramePr>
               <a:graphicFrameLocks noChangeAspect="1"/>
@@ -3892,7 +3892,7 @@
                   <pic:spPr>
                     <a:xfrm>
                       <a:off x="0" y="0"/>
-                      <a:ext cx="5852160" cy="3885047"/>
+                      <a:ext cx="5852160" cy="3737661"/>
                     </a:xfrm>
                     <a:prstGeom prst="rect"/>
                   </pic:spPr>
@@ -3958,7 +3958,7 @@
       <w:r>
         <w:drawing>
           <wp:inline xmlns:a="http://schemas.openxmlformats.org/drawingml/2006/main" xmlns:pic="http://schemas.openxmlformats.org/drawingml/2006/picture">
-            <wp:extent cx="5852160" cy="3885047"/>
+            <wp:extent cx="5852160" cy="3684629"/>
             <wp:docPr id="5" name="Picture 5"/>
             <wp:cNvGraphicFramePr>
               <a:graphicFrameLocks noChangeAspect="1"/>
@@ -3979,7 +3979,7 @@
                   <pic:spPr>
                     <a:xfrm>
                       <a:off x="0" y="0"/>
-                      <a:ext cx="5852160" cy="3885047"/>
+                      <a:ext cx="5852160" cy="3684629"/>
                     </a:xfrm>
                     <a:prstGeom prst="rect"/>
                   </pic:spPr>
@@ -4045,7 +4045,7 @@
       <w:r>
         <w:drawing>
           <wp:inline xmlns:a="http://schemas.openxmlformats.org/drawingml/2006/main" xmlns:pic="http://schemas.openxmlformats.org/drawingml/2006/picture">
-            <wp:extent cx="5852160" cy="3885047"/>
+            <wp:extent cx="5852160" cy="3728717"/>
             <wp:docPr id="6" name="Picture 6"/>
             <wp:cNvGraphicFramePr>
               <a:graphicFrameLocks noChangeAspect="1"/>
@@ -4066,7 +4066,7 @@
                   <pic:spPr>
                     <a:xfrm>
                       <a:off x="0" y="0"/>
-                      <a:ext cx="5852160" cy="3885047"/>
+                      <a:ext cx="5852160" cy="3728717"/>
                     </a:xfrm>
                     <a:prstGeom prst="rect"/>
                   </pic:spPr>
@@ -4132,7 +4132,7 @@
       <w:r>
         <w:drawing>
           <wp:inline xmlns:a="http://schemas.openxmlformats.org/drawingml/2006/main" xmlns:pic="http://schemas.openxmlformats.org/drawingml/2006/picture">
-            <wp:extent cx="5852160" cy="3885047"/>
+            <wp:extent cx="5852160" cy="3661360"/>
             <wp:docPr id="7" name="Picture 7"/>
             <wp:cNvGraphicFramePr>
               <a:graphicFrameLocks noChangeAspect="1"/>
@@ -4153,7 +4153,7 @@
                   <pic:spPr>
                     <a:xfrm>
                       <a:off x="0" y="0"/>
-                      <a:ext cx="5852160" cy="3885047"/>
+                      <a:ext cx="5852160" cy="3661360"/>
                     </a:xfrm>
                     <a:prstGeom prst="rect"/>
                   </pic:spPr>

</xml_diff>